<commit_message>
Fix page break style preservation in round-trip
The codec was losing paragraph styles on page-break-only paragraphs.
Now page_break blocks capture and restore the pStyle if present.

Changes:
- docx_to_docxlang: Capture pStyle on page_break blocks
- docxlang_to_docx: Apply pStyle when rendering page_break blocks

This fixes the Sub-header (CVHP) style being lost in round-trip.
</commit_message>
<xml_diff>
--- a/full_sample_output.docx
+++ b/full_sample_output.docx
@@ -121,7 +121,7 @@
     </w:p>
     <w:p>
       <w:pPr>
-        <w:pStyle w:val="Sub-bullet2CVHP"/>
+        <w:pStyle w:val="Sub-headerCVHP"/>
       </w:pPr>
       <w:r>
         <w:t>Document API endpoints and data formats</w:t>
@@ -129,7 +129,7 @@
     </w:p>
     <w:p>
       <w:pPr>
-        <w:pStyle w:val="Sub-bullet2CVHP"/>
+        <w:pStyle w:val="Sub-headerCVHP"/>
       </w:pPr>
       <w:r>
         <w:t>Evaluate security and compliance requirements</w:t>

</xml_diff>